<commit_message>
feasibility v2: fix cash-flow double-count, payback 3.2y, take-rate assumption, follower consistency
</commit_message>
<xml_diff>
--- a/marketing/WinWin-Feasibility-Study.docx
+++ b/marketing/WinWin-Feasibility-Study.docx
@@ -275,7 +275,7 @@
                 <w:szCs w:val="20"/>
                 <w:rtl/>
               </w:rPr>
-              <w:t xml:space="preserve">• الاستثمار المطلوب: نحو 1.2 مليون ريال لتغطية 3 سنوات تشغيل + رأس المال العامل.</w:t>
+              <w:t xml:space="preserve">• الاستثمار المطلوب: 1.2 مليون ريال (تأسيس 250 ألفاً + تمويل خسائر أول سنتين ~890 ألفاً + احتياطي ~60 ألفاً).</w:t>
             </w:r>
           </w:p>
           <w:p>
@@ -290,7 +290,7 @@
                 <w:szCs w:val="20"/>
                 <w:rtl/>
               </w:rPr>
-              <w:t xml:space="preserve">• الوصول لنقطة التعادل: خلال الربع الأول من السنة الثالثة تقريباً.</w:t>
+              <w:t xml:space="preserve">• الوصول لنقطة التعادل التشغيلي: أوائل السنة الثالثة.</w:t>
             </w:r>
           </w:p>
           <w:p>
@@ -305,7 +305,7 @@
                 <w:szCs w:val="20"/>
                 <w:rtl/>
               </w:rPr>
-              <w:t xml:space="preserve">• صافي ربح متوقع في السنة الثالثة: ~0.8 مليون ريال، بهامش صافٍ ~22٪.</w:t>
+              <w:t xml:space="preserve">• صافي ربح متوقع في السنة الثالثة: ~0.8 مليون ريال، بهامش صافٍ ~22٪ من الإيراد.</w:t>
             </w:r>
           </w:p>
           <w:p>
@@ -320,7 +320,7 @@
                 <w:szCs w:val="20"/>
                 <w:rtl/>
               </w:rPr>
-              <w:t xml:space="preserve">• معدل العائد الداخلي (IRR) على 5 سنوات: ~35–45٪ (سيناريو أساسي).</w:t>
+              <w:t xml:space="preserve">• فترة استرداد رأس المال: ~3.2 سنة | معدل العائد الداخلي (IRR): ~40٪ (سيناريو أساسي).</w:t>
             </w:r>
           </w:p>
         </w:tc>
@@ -1093,7 +1093,7 @@
           <w:rFonts w:ascii="Arial" w:cs="Arial" w:eastAsia="Arial" w:hAnsi="Arial"/>
           <w:rtl/>
         </w:rPr>
-        <w:t xml:space="preserve">تُعدّ المملكة من أعلى دول العالم في معدلات استخدام وسائل التواصل الاجتماعي، مع انتشار إنترنت يتجاوز 90٪ وأكثر من 26 مليون مستخدم نشط للسوشيال ميديا، وريادة عالمية في استخدام سناب شات وتيك توك. يوازي ذلك نموّاً متسارعاً في الإنفاق على الإعلان الرقمي وتسويق المؤثرين.</w:t>
+        <w:t xml:space="preserve">تُعدّ المملكة من أعلى دول العالم في معدلات استخدام وسائل التواصل الاجتماعي، مع انتشار إنترنت يتجاوز 90٪ وأكثر من 26 مليون مستخدم نشط للسوشيال ميديا، ومعدلات استخدام لسناب شات وتيك توك من الأعلى عالمياً. يوازي ذلك نموّاً متسارعاً في الإنفاق على الإعلان الرقمي وتسويق المؤثرين. (يوصى بتوثيق هذه الأرقام من مصادر رسمية محدّثة — GASTAT / تقارير القطاع — قبل جولة الاستثمار).</w:t>
       </w:r>
     </w:p>
     <w:tbl>
@@ -1230,7 +1230,7 @@
           <w:rFonts w:ascii="Arial" w:cs="Arial" w:eastAsia="Arial" w:hAnsi="Arial"/>
           <w:rtl/>
         </w:rPr>
-        <w:t xml:space="preserve">المستخدمون: أصحاب الحسابات من 15k–500k متابع (المؤثرون الصغار والمتوسطون) الباحثون عن دخل إضافي.</w:t>
+        <w:t xml:space="preserve">المستخدمون: أصحاب الحسابات النشطة — المنتج يقبل الانضمام بدءاً من 100 متابع، مع تركيز تسويقي على المؤثرين الصغار والمتوسطين (1,000 إلى 500,000 متابع) الباحثين عن دخل إضافي.</w:t>
       </w:r>
     </w:p>
     <w:p>
@@ -2592,6 +2592,24 @@
           <w:rFonts w:ascii="Arial" w:cs="Arial" w:eastAsia="Arial" w:hAnsi="Arial"/>
           <w:rtl/>
         </w:rPr>
+        <w:t xml:space="preserve">صلاحية الرصيد 90 يوماً — يحفّز الاستخدام النشط ويحسّن التدفق النقدي للمنصة.</w:t>
+      </w:r>
+    </w:p>
+    <w:p>
+      <w:pPr>
+        <w:pStyle w:val="ListParagraph"/>
+        <w:numPr>
+          <w:ilvl w:val="0"/>
+          <w:numId w:val="2"/>
+        </w:numPr>
+        <w:bidi/>
+        <w:spacing w:after="70" w:line="290"/>
+      </w:pPr>
+      <w:r>
+        <w:rPr>
+          <w:rFonts w:ascii="Arial" w:cs="Arial" w:eastAsia="Arial" w:hAnsi="Arial"/>
+          <w:rtl/>
+        </w:rPr>
         <w:t xml:space="preserve">عزل صلاحيات صارم: كل براند يرى بياناته فقط، والأدمن يدير الكل.</w:t>
       </w:r>
     </w:p>
@@ -4577,6 +4595,111 @@
         <w:t xml:space="preserve">الأرقام التالية تقديرية لأغراض الدراسة، بعملة الريال السعودي، وتُبنى على سيناريو أساسي معتدل. يجب تحديثها ببيانات فعلية عند التشغيل.</w:t>
       </w:r>
     </w:p>
+    <w:tbl>
+      <w:tblPr>
+        <w:bidiVisual/>
+        <w:tblW w:type="dxa" w:w="9026"/>
+        <w:tblBorders>
+          <w:top w:val="single" w:color="auto" w:sz="4"/>
+          <w:left w:val="single" w:color="auto" w:sz="4"/>
+          <w:bottom w:val="single" w:color="auto" w:sz="4"/>
+          <w:right w:val="single" w:color="auto" w:sz="4"/>
+          <w:insideH w:val="single" w:color="auto" w:sz="4"/>
+          <w:insideV w:val="single" w:color="auto" w:sz="4"/>
+        </w:tblBorders>
+      </w:tblPr>
+      <w:tblGrid>
+        <w:gridCol w:w="9026"/>
+      </w:tblGrid>
+      <w:tr>
+        <w:tc>
+          <w:tcPr>
+            <w:tcW w:type="dxa" w:w="9026"/>
+            <w:tcBorders>
+              <w:top w:val="single" w:color="0E2254" w:sz="4"/>
+              <w:left w:val="single" w:color="0E2254" w:sz="4"/>
+              <w:bottom w:val="single" w:color="0E2254" w:sz="4"/>
+              <w:right w:val="single" w:color="0E2254" w:sz="4"/>
+            </w:tcBorders>
+            <w:shd w:fill="EEF4F1" w:val="clear"/>
+            <w:tcMar>
+              <w:top w:type="dxa" w:w="110"/>
+              <w:left w:type="dxa" w:w="150"/>
+              <w:bottom w:type="dxa" w:w="110"/>
+              <w:right w:type="dxa" w:w="150"/>
+            </w:tcMar>
+          </w:tcPr>
+          <w:p>
+            <w:pPr>
+              <w:bidi/>
+              <w:spacing w:after="70"/>
+            </w:pPr>
+            <w:r>
+              <w:rPr>
+                <w:rFonts w:ascii="Arial" w:cs="Arial" w:eastAsia="Arial" w:hAnsi="Arial"/>
+                <w:b/>
+                <w:bCs/>
+                <w:color w:val="0E2254"/>
+                <w:sz w:val="22"/>
+                <w:szCs w:val="22"/>
+                <w:rtl/>
+              </w:rPr>
+              <w:t xml:space="preserve">الفرضيات الأساسية للنموذج</w:t>
+            </w:r>
+          </w:p>
+          <w:p>
+            <w:pPr>
+              <w:bidi/>
+              <w:spacing w:after="50" w:line="280"/>
+            </w:pPr>
+            <w:r>
+              <w:rPr>
+                <w:rFonts w:ascii="Arial" w:cs="Arial" w:eastAsia="Arial" w:hAnsi="Arial"/>
+                <w:sz w:val="20"/>
+                <w:szCs w:val="20"/>
+                <w:rtl/>
+              </w:rPr>
+              <w:t xml:space="preserve">• نسبة العمولة الفعلية المجمّعة (Take Rate): 8٪ من إجمالي قيمة المنشورات (GMV) — بافتراض أن 70٪ من الحجم يمر عبر الحملات العادية (عمولة 5٪) و30٪ عبر جلسات البث المباشر (عمولة 15٪): (0.70×5٪) + (0.30×15٪) = 8٪.</w:t>
+            </w:r>
+          </w:p>
+          <w:p>
+            <w:pPr>
+              <w:bidi/>
+              <w:spacing w:after="50" w:line="280"/>
+            </w:pPr>
+            <w:r>
+              <w:rPr>
+                <w:rFonts w:ascii="Arial" w:cs="Arial" w:eastAsia="Arial" w:hAnsi="Arial"/>
+                <w:sz w:val="20"/>
+                <w:szCs w:val="20"/>
+                <w:rtl/>
+              </w:rPr>
+              <w:t xml:space="preserve">• أهداف السنة الأولى: 20,000 مستخدم نشط و50 براند ⇒ GMV ≈ 4 ملايين ريال (متوسط إنفاق سنوي ~80 ألف ريال للبراند، و~200 ريال أرباحاً للمستخدم).</w:t>
+            </w:r>
+          </w:p>
+          <w:p>
+            <w:pPr>
+              <w:bidi/>
+              <w:spacing w:after="50" w:line="280"/>
+            </w:pPr>
+            <w:r>
+              <w:rPr>
+                <w:rFonts w:ascii="Arial" w:cs="Arial" w:eastAsia="Arial" w:hAnsi="Arial"/>
+                <w:sz w:val="20"/>
+                <w:szCs w:val="20"/>
+                <w:rtl/>
+              </w:rPr>
+              <w:t xml:space="preserve">• جميع الأرقام غير شاملة ضريبة القيمة المضافة (15٪).</w:t>
+            </w:r>
+          </w:p>
+        </w:tc>
+      </w:tr>
+    </w:tbl>
+    <w:p>
+      <w:pPr>
+        <w:spacing w:after="100"/>
+      </w:pPr>
+    </w:p>
     <w:p>
       <w:pPr>
         <w:pStyle w:val="Heading2"/>
@@ -5061,6 +5184,20 @@
         </w:tc>
       </w:tr>
     </w:tbl>
+    <w:p>
+      <w:pPr>
+        <w:bidi/>
+        <w:spacing w:after="120" w:line="300"/>
+        <w:jc w:val="start"/>
+      </w:pPr>
+      <w:r>
+        <w:rPr>
+          <w:rFonts w:ascii="Arial" w:cs="Arial" w:eastAsia="Arial" w:hAnsi="Arial"/>
+          <w:rtl/>
+        </w:rPr>
+        <w:t xml:space="preserve">تدخل هذه التكاليف ضمن إجمالي الاستثمار المطلوب (1.2 مليون ريال)، الذي يغطي أيضاً خسائر التشغيل المتوقعة لأول سنتين واحتياطياً نقدياً.</w:t>
+      </w:r>
+    </w:p>
     <w:p>
       <w:pPr>
         <w:pStyle w:val="Heading2"/>
@@ -6530,7 +6667,7 @@
           <w:szCs w:val="26"/>
           <w:rtl/>
         </w:rPr>
-        <w:t xml:space="preserve">9.1 التدفقات النقدية (5 سنوات، سيناريو أساسي)</w:t>
+        <w:t xml:space="preserve">9.1 التدفقات النقدية من منظور المستثمر (5 سنوات، سيناريو أساسي)</w:t>
       </w:r>
     </w:p>
     <w:tbl>
@@ -6547,9 +6684,9 @@
         </w:tblBorders>
       </w:tblPr>
       <w:tblGrid>
-        <w:gridCol w:w="3026"/>
-        <w:gridCol w:w="3000"/>
-        <w:gridCol w:w="3000"/>
+        <w:gridCol w:w="4226"/>
+        <w:gridCol w:w="2400"/>
+        <w:gridCol w:w="2400"/>
       </w:tblGrid>
       <w:tr>
         <w:trPr>
@@ -6557,7 +6694,7 @@
         </w:trPr>
         <w:tc>
           <w:tcPr>
-            <w:tcW w:type="dxa" w:w="3026"/>
+            <w:tcW w:type="dxa" w:w="4226"/>
             <w:tcBorders>
               <w:top w:val="single" w:color="B4C4BC" w:sz="1"/>
               <w:left w:val="single" w:color="B4C4BC" w:sz="1"/>
@@ -6593,7 +6730,7 @@
         </w:tc>
         <w:tc>
           <w:tcPr>
-            <w:tcW w:type="dxa" w:w="3000"/>
+            <w:tcW w:type="dxa" w:w="2400"/>
             <w:tcBorders>
               <w:top w:val="single" w:color="B4C4BC" w:sz="1"/>
               <w:left w:val="single" w:color="B4C4BC" w:sz="1"/>
@@ -6629,7 +6766,7 @@
         </w:tc>
         <w:tc>
           <w:tcPr>
-            <w:tcW w:type="dxa" w:w="3000"/>
+            <w:tcW w:type="dxa" w:w="2400"/>
             <w:tcBorders>
               <w:top w:val="single" w:color="B4C4BC" w:sz="1"/>
               <w:left w:val="single" w:color="B4C4BC" w:sz="1"/>
@@ -6667,43 +6804,43 @@
       <w:tr>
         <w:tc>
           <w:tcPr>
-            <w:tcW w:type="dxa" w:w="3026"/>
-            <w:tcBorders>
-              <w:top w:val="single" w:color="B4C4BC" w:sz="1"/>
-              <w:left w:val="single" w:color="B4C4BC" w:sz="1"/>
-              <w:bottom w:val="single" w:color="B4C4BC" w:sz="1"/>
-              <w:right w:val="single" w:color="B4C4BC" w:sz="1"/>
-            </w:tcBorders>
-            <w:shd w:fill="FFFFFF" w:val="clear"/>
-            <w:tcMar>
-              <w:top w:type="dxa" w:w="70"/>
-              <w:left w:type="dxa" w:w="100"/>
-              <w:bottom w:type="dxa" w:w="70"/>
-              <w:right w:type="dxa" w:w="100"/>
-            </w:tcMar>
-          </w:tcPr>
-          <w:p>
-            <w:pPr>
-              <w:bidi/>
-              <w:jc w:val="start"/>
-            </w:pPr>
-            <w:r>
-              <w:rPr>
-                <w:rFonts w:ascii="Arial" w:cs="Arial" w:eastAsia="Arial" w:hAnsi="Arial"/>
-                <w:b w:val="function bold() { [native code] }"/>
-                <w:bCs w:val="function bold() { [native code] }"/>
-                <w:color w:val="111111"/>
-                <w:sz w:val="20"/>
-                <w:szCs w:val="20"/>
-                <w:rtl/>
-              </w:rPr>
-              <w:t xml:space="preserve">السنة 0 (استثمار)</w:t>
-            </w:r>
-          </w:p>
-        </w:tc>
-        <w:tc>
-          <w:tcPr>
-            <w:tcW w:type="dxa" w:w="3000"/>
+            <w:tcW w:type="dxa" w:w="4226"/>
+            <w:tcBorders>
+              <w:top w:val="single" w:color="B4C4BC" w:sz="1"/>
+              <w:left w:val="single" w:color="B4C4BC" w:sz="1"/>
+              <w:bottom w:val="single" w:color="B4C4BC" w:sz="1"/>
+              <w:right w:val="single" w:color="B4C4BC" w:sz="1"/>
+            </w:tcBorders>
+            <w:shd w:fill="FFFFFF" w:val="clear"/>
+            <w:tcMar>
+              <w:top w:type="dxa" w:w="70"/>
+              <w:left w:type="dxa" w:w="100"/>
+              <w:bottom w:type="dxa" w:w="70"/>
+              <w:right w:type="dxa" w:w="100"/>
+            </w:tcMar>
+          </w:tcPr>
+          <w:p>
+            <w:pPr>
+              <w:bidi/>
+              <w:jc w:val="start"/>
+            </w:pPr>
+            <w:r>
+              <w:rPr>
+                <w:rFonts w:ascii="Arial" w:cs="Arial" w:eastAsia="Arial" w:hAnsi="Arial"/>
+                <w:b w:val="function bold() { [native code] }"/>
+                <w:bCs w:val="function bold() { [native code] }"/>
+                <w:color w:val="111111"/>
+                <w:sz w:val="20"/>
+                <w:szCs w:val="20"/>
+                <w:rtl/>
+              </w:rPr>
+              <w:t xml:space="preserve">السنة 0 — ضخ الاستثمار (تأسيس + تمويل الخسائر + احتياطي)</w:t>
+            </w:r>
+          </w:p>
+        </w:tc>
+        <w:tc>
+          <w:tcPr>
+            <w:tcW w:type="dxa" w:w="2400"/>
             <w:tcBorders>
               <w:top w:val="single" w:color="B4C4BC" w:sz="1"/>
               <w:left w:val="single" w:color="B4C4BC" w:sz="1"/>
@@ -6739,7 +6876,7 @@
         </w:tc>
         <w:tc>
           <w:tcPr>
-            <w:tcW w:type="dxa" w:w="3000"/>
+            <w:tcW w:type="dxa" w:w="2400"/>
             <w:tcBorders>
               <w:top w:val="single" w:color="B4C4BC" w:sz="1"/>
               <w:left w:val="single" w:color="B4C4BC" w:sz="1"/>
@@ -6777,109 +6914,109 @@
       <w:tr>
         <w:tc>
           <w:tcPr>
-            <w:tcW w:type="dxa" w:w="3026"/>
-            <w:tcBorders>
-              <w:top w:val="single" w:color="B4C4BC" w:sz="1"/>
-              <w:left w:val="single" w:color="B4C4BC" w:sz="1"/>
-              <w:bottom w:val="single" w:color="B4C4BC" w:sz="1"/>
-              <w:right w:val="single" w:color="B4C4BC" w:sz="1"/>
-            </w:tcBorders>
-            <w:shd w:fill="FFFFFF" w:val="clear"/>
-            <w:tcMar>
-              <w:top w:type="dxa" w:w="70"/>
-              <w:left w:type="dxa" w:w="100"/>
-              <w:bottom w:type="dxa" w:w="70"/>
-              <w:right w:type="dxa" w:w="100"/>
-            </w:tcMar>
-          </w:tcPr>
-          <w:p>
-            <w:pPr>
-              <w:bidi/>
-              <w:jc w:val="start"/>
-            </w:pPr>
-            <w:r>
-              <w:rPr>
-                <w:rFonts w:ascii="Arial" w:cs="Arial" w:eastAsia="Arial" w:hAnsi="Arial"/>
-                <w:b w:val="function bold() { [native code] }"/>
-                <w:bCs w:val="function bold() { [native code] }"/>
-                <w:color w:val="111111"/>
-                <w:sz w:val="20"/>
-                <w:szCs w:val="20"/>
-                <w:rtl/>
-              </w:rPr>
-              <w:t xml:space="preserve">السنة 1</w:t>
-            </w:r>
-          </w:p>
-        </w:tc>
-        <w:tc>
-          <w:tcPr>
-            <w:tcW w:type="dxa" w:w="3000"/>
-            <w:tcBorders>
-              <w:top w:val="single" w:color="B4C4BC" w:sz="1"/>
-              <w:left w:val="single" w:color="B4C4BC" w:sz="1"/>
-              <w:bottom w:val="single" w:color="B4C4BC" w:sz="1"/>
-              <w:right w:val="single" w:color="B4C4BC" w:sz="1"/>
-            </w:tcBorders>
-            <w:shd w:fill="FFFFFF" w:val="clear"/>
-            <w:tcMar>
-              <w:top w:type="dxa" w:w="70"/>
-              <w:left w:type="dxa" w:w="100"/>
-              <w:bottom w:type="dxa" w:w="70"/>
-              <w:right w:type="dxa" w:w="100"/>
-            </w:tcMar>
-          </w:tcPr>
-          <w:p>
-            <w:pPr>
-              <w:bidi/>
-              <w:jc w:val="start"/>
-            </w:pPr>
-            <w:r>
-              <w:rPr>
-                <w:rFonts w:ascii="Arial" w:cs="Arial" w:eastAsia="Arial" w:hAnsi="Arial"/>
-                <w:b w:val="function bold() { [native code] }"/>
-                <w:bCs w:val="function bold() { [native code] }"/>
-                <w:color w:val="111111"/>
-                <w:sz w:val="20"/>
-                <w:szCs w:val="20"/>
-                <w:rtl/>
-              </w:rPr>
-              <w:t xml:space="preserve">(600,000)</w:t>
-            </w:r>
-          </w:p>
-        </w:tc>
-        <w:tc>
-          <w:tcPr>
-            <w:tcW w:type="dxa" w:w="3000"/>
-            <w:tcBorders>
-              <w:top w:val="single" w:color="B4C4BC" w:sz="1"/>
-              <w:left w:val="single" w:color="B4C4BC" w:sz="1"/>
-              <w:bottom w:val="single" w:color="B4C4BC" w:sz="1"/>
-              <w:right w:val="single" w:color="B4C4BC" w:sz="1"/>
-            </w:tcBorders>
-            <w:shd w:fill="FFFFFF" w:val="clear"/>
-            <w:tcMar>
-              <w:top w:type="dxa" w:w="70"/>
-              <w:left w:type="dxa" w:w="100"/>
-              <w:bottom w:type="dxa" w:w="70"/>
-              <w:right w:type="dxa" w:w="100"/>
-            </w:tcMar>
-          </w:tcPr>
-          <w:p>
-            <w:pPr>
-              <w:bidi/>
-              <w:jc w:val="start"/>
-            </w:pPr>
-            <w:r>
-              <w:rPr>
-                <w:rFonts w:ascii="Arial" w:cs="Arial" w:eastAsia="Arial" w:hAnsi="Arial"/>
-                <w:b w:val="function bold() { [native code] }"/>
-                <w:bCs w:val="function bold() { [native code] }"/>
-                <w:color w:val="111111"/>
-                <w:sz w:val="20"/>
-                <w:szCs w:val="20"/>
-                <w:rtl/>
-              </w:rPr>
-              <w:t xml:space="preserve">(1,800,000)</w:t>
+            <w:tcW w:type="dxa" w:w="4226"/>
+            <w:tcBorders>
+              <w:top w:val="single" w:color="B4C4BC" w:sz="1"/>
+              <w:left w:val="single" w:color="B4C4BC" w:sz="1"/>
+              <w:bottom w:val="single" w:color="B4C4BC" w:sz="1"/>
+              <w:right w:val="single" w:color="B4C4BC" w:sz="1"/>
+            </w:tcBorders>
+            <w:shd w:fill="FFFFFF" w:val="clear"/>
+            <w:tcMar>
+              <w:top w:type="dxa" w:w="70"/>
+              <w:left w:type="dxa" w:w="100"/>
+              <w:bottom w:type="dxa" w:w="70"/>
+              <w:right w:type="dxa" w:w="100"/>
+            </w:tcMar>
+          </w:tcPr>
+          <w:p>
+            <w:pPr>
+              <w:bidi/>
+              <w:jc w:val="start"/>
+            </w:pPr>
+            <w:r>
+              <w:rPr>
+                <w:rFonts w:ascii="Arial" w:cs="Arial" w:eastAsia="Arial" w:hAnsi="Arial"/>
+                <w:b w:val="function bold() { [native code] }"/>
+                <w:bCs w:val="function bold() { [native code] }"/>
+                <w:color w:val="111111"/>
+                <w:sz w:val="20"/>
+                <w:szCs w:val="20"/>
+                <w:rtl/>
+              </w:rPr>
+              <w:t xml:space="preserve">السنة 1 — خسائر التشغيل ممولة من الاستثمار</w:t>
+            </w:r>
+          </w:p>
+        </w:tc>
+        <w:tc>
+          <w:tcPr>
+            <w:tcW w:type="dxa" w:w="2400"/>
+            <w:tcBorders>
+              <w:top w:val="single" w:color="B4C4BC" w:sz="1"/>
+              <w:left w:val="single" w:color="B4C4BC" w:sz="1"/>
+              <w:bottom w:val="single" w:color="B4C4BC" w:sz="1"/>
+              <w:right w:val="single" w:color="B4C4BC" w:sz="1"/>
+            </w:tcBorders>
+            <w:shd w:fill="FFFFFF" w:val="clear"/>
+            <w:tcMar>
+              <w:top w:type="dxa" w:w="70"/>
+              <w:left w:type="dxa" w:w="100"/>
+              <w:bottom w:type="dxa" w:w="70"/>
+              <w:right w:type="dxa" w:w="100"/>
+            </w:tcMar>
+          </w:tcPr>
+          <w:p>
+            <w:pPr>
+              <w:bidi/>
+              <w:jc w:val="start"/>
+            </w:pPr>
+            <w:r>
+              <w:rPr>
+                <w:rFonts w:ascii="Arial" w:cs="Arial" w:eastAsia="Arial" w:hAnsi="Arial"/>
+                <w:b w:val="function bold() { [native code] }"/>
+                <w:bCs w:val="function bold() { [native code] }"/>
+                <w:color w:val="111111"/>
+                <w:sz w:val="20"/>
+                <w:szCs w:val="20"/>
+                <w:rtl/>
+              </w:rPr>
+              <w:t xml:space="preserve">0</w:t>
+            </w:r>
+          </w:p>
+        </w:tc>
+        <w:tc>
+          <w:tcPr>
+            <w:tcW w:type="dxa" w:w="2400"/>
+            <w:tcBorders>
+              <w:top w:val="single" w:color="B4C4BC" w:sz="1"/>
+              <w:left w:val="single" w:color="B4C4BC" w:sz="1"/>
+              <w:bottom w:val="single" w:color="B4C4BC" w:sz="1"/>
+              <w:right w:val="single" w:color="B4C4BC" w:sz="1"/>
+            </w:tcBorders>
+            <w:shd w:fill="FFFFFF" w:val="clear"/>
+            <w:tcMar>
+              <w:top w:type="dxa" w:w="70"/>
+              <w:left w:type="dxa" w:w="100"/>
+              <w:bottom w:type="dxa" w:w="70"/>
+              <w:right w:type="dxa" w:w="100"/>
+            </w:tcMar>
+          </w:tcPr>
+          <w:p>
+            <w:pPr>
+              <w:bidi/>
+              <w:jc w:val="start"/>
+            </w:pPr>
+            <w:r>
+              <w:rPr>
+                <w:rFonts w:ascii="Arial" w:cs="Arial" w:eastAsia="Arial" w:hAnsi="Arial"/>
+                <w:b w:val="function bold() { [native code] }"/>
+                <w:bCs w:val="function bold() { [native code] }"/>
+                <w:color w:val="111111"/>
+                <w:sz w:val="20"/>
+                <w:szCs w:val="20"/>
+                <w:rtl/>
+              </w:rPr>
+              <w:t xml:space="preserve">(1,200,000)</w:t>
             </w:r>
           </w:p>
         </w:tc>
@@ -6887,109 +7024,109 @@
       <w:tr>
         <w:tc>
           <w:tcPr>
-            <w:tcW w:type="dxa" w:w="3026"/>
-            <w:tcBorders>
-              <w:top w:val="single" w:color="B4C4BC" w:sz="1"/>
-              <w:left w:val="single" w:color="B4C4BC" w:sz="1"/>
-              <w:bottom w:val="single" w:color="B4C4BC" w:sz="1"/>
-              <w:right w:val="single" w:color="B4C4BC" w:sz="1"/>
-            </w:tcBorders>
-            <w:shd w:fill="FFFFFF" w:val="clear"/>
-            <w:tcMar>
-              <w:top w:type="dxa" w:w="70"/>
-              <w:left w:type="dxa" w:w="100"/>
-              <w:bottom w:type="dxa" w:w="70"/>
-              <w:right w:type="dxa" w:w="100"/>
-            </w:tcMar>
-          </w:tcPr>
-          <w:p>
-            <w:pPr>
-              <w:bidi/>
-              <w:jc w:val="start"/>
-            </w:pPr>
-            <w:r>
-              <w:rPr>
-                <w:rFonts w:ascii="Arial" w:cs="Arial" w:eastAsia="Arial" w:hAnsi="Arial"/>
-                <w:b w:val="function bold() { [native code] }"/>
-                <w:bCs w:val="function bold() { [native code] }"/>
-                <w:color w:val="111111"/>
-                <w:sz w:val="20"/>
-                <w:szCs w:val="20"/>
-                <w:rtl/>
-              </w:rPr>
-              <w:t xml:space="preserve">السنة 2</w:t>
-            </w:r>
-          </w:p>
-        </w:tc>
-        <w:tc>
-          <w:tcPr>
-            <w:tcW w:type="dxa" w:w="3000"/>
-            <w:tcBorders>
-              <w:top w:val="single" w:color="B4C4BC" w:sz="1"/>
-              <w:left w:val="single" w:color="B4C4BC" w:sz="1"/>
-              <w:bottom w:val="single" w:color="B4C4BC" w:sz="1"/>
-              <w:right w:val="single" w:color="B4C4BC" w:sz="1"/>
-            </w:tcBorders>
-            <w:shd w:fill="FFFFFF" w:val="clear"/>
-            <w:tcMar>
-              <w:top w:type="dxa" w:w="70"/>
-              <w:left w:type="dxa" w:w="100"/>
-              <w:bottom w:type="dxa" w:w="70"/>
-              <w:right w:type="dxa" w:w="100"/>
-            </w:tcMar>
-          </w:tcPr>
-          <w:p>
-            <w:pPr>
-              <w:bidi/>
-              <w:jc w:val="start"/>
-            </w:pPr>
-            <w:r>
-              <w:rPr>
-                <w:rFonts w:ascii="Arial" w:cs="Arial" w:eastAsia="Arial" w:hAnsi="Arial"/>
-                <w:b w:val="function bold() { [native code] }"/>
-                <w:bCs w:val="function bold() { [native code] }"/>
-                <w:color w:val="111111"/>
-                <w:sz w:val="20"/>
-                <w:szCs w:val="20"/>
-                <w:rtl/>
-              </w:rPr>
-              <w:t xml:space="preserve">(290,000)</w:t>
-            </w:r>
-          </w:p>
-        </w:tc>
-        <w:tc>
-          <w:tcPr>
-            <w:tcW w:type="dxa" w:w="3000"/>
-            <w:tcBorders>
-              <w:top w:val="single" w:color="B4C4BC" w:sz="1"/>
-              <w:left w:val="single" w:color="B4C4BC" w:sz="1"/>
-              <w:bottom w:val="single" w:color="B4C4BC" w:sz="1"/>
-              <w:right w:val="single" w:color="B4C4BC" w:sz="1"/>
-            </w:tcBorders>
-            <w:shd w:fill="FFFFFF" w:val="clear"/>
-            <w:tcMar>
-              <w:top w:type="dxa" w:w="70"/>
-              <w:left w:type="dxa" w:w="100"/>
-              <w:bottom w:type="dxa" w:w="70"/>
-              <w:right w:type="dxa" w:w="100"/>
-            </w:tcMar>
-          </w:tcPr>
-          <w:p>
-            <w:pPr>
-              <w:bidi/>
-              <w:jc w:val="start"/>
-            </w:pPr>
-            <w:r>
-              <w:rPr>
-                <w:rFonts w:ascii="Arial" w:cs="Arial" w:eastAsia="Arial" w:hAnsi="Arial"/>
-                <w:b w:val="function bold() { [native code] }"/>
-                <w:bCs w:val="function bold() { [native code] }"/>
-                <w:color w:val="111111"/>
-                <w:sz w:val="20"/>
-                <w:szCs w:val="20"/>
-                <w:rtl/>
-              </w:rPr>
-              <w:t xml:space="preserve">(2,090,000)</w:t>
+            <w:tcW w:type="dxa" w:w="4226"/>
+            <w:tcBorders>
+              <w:top w:val="single" w:color="B4C4BC" w:sz="1"/>
+              <w:left w:val="single" w:color="B4C4BC" w:sz="1"/>
+              <w:bottom w:val="single" w:color="B4C4BC" w:sz="1"/>
+              <w:right w:val="single" w:color="B4C4BC" w:sz="1"/>
+            </w:tcBorders>
+            <w:shd w:fill="FFFFFF" w:val="clear"/>
+            <w:tcMar>
+              <w:top w:type="dxa" w:w="70"/>
+              <w:left w:type="dxa" w:w="100"/>
+              <w:bottom w:type="dxa" w:w="70"/>
+              <w:right w:type="dxa" w:w="100"/>
+            </w:tcMar>
+          </w:tcPr>
+          <w:p>
+            <w:pPr>
+              <w:bidi/>
+              <w:jc w:val="start"/>
+            </w:pPr>
+            <w:r>
+              <w:rPr>
+                <w:rFonts w:ascii="Arial" w:cs="Arial" w:eastAsia="Arial" w:hAnsi="Arial"/>
+                <w:b w:val="function bold() { [native code] }"/>
+                <w:bCs w:val="function bold() { [native code] }"/>
+                <w:color w:val="111111"/>
+                <w:sz w:val="20"/>
+                <w:szCs w:val="20"/>
+                <w:rtl/>
+              </w:rPr>
+              <w:t xml:space="preserve">السنة 2 — خسائر التشغيل ممولة من الاستثمار</w:t>
+            </w:r>
+          </w:p>
+        </w:tc>
+        <w:tc>
+          <w:tcPr>
+            <w:tcW w:type="dxa" w:w="2400"/>
+            <w:tcBorders>
+              <w:top w:val="single" w:color="B4C4BC" w:sz="1"/>
+              <w:left w:val="single" w:color="B4C4BC" w:sz="1"/>
+              <w:bottom w:val="single" w:color="B4C4BC" w:sz="1"/>
+              <w:right w:val="single" w:color="B4C4BC" w:sz="1"/>
+            </w:tcBorders>
+            <w:shd w:fill="FFFFFF" w:val="clear"/>
+            <w:tcMar>
+              <w:top w:type="dxa" w:w="70"/>
+              <w:left w:type="dxa" w:w="100"/>
+              <w:bottom w:type="dxa" w:w="70"/>
+              <w:right w:type="dxa" w:w="100"/>
+            </w:tcMar>
+          </w:tcPr>
+          <w:p>
+            <w:pPr>
+              <w:bidi/>
+              <w:jc w:val="start"/>
+            </w:pPr>
+            <w:r>
+              <w:rPr>
+                <w:rFonts w:ascii="Arial" w:cs="Arial" w:eastAsia="Arial" w:hAnsi="Arial"/>
+                <w:b w:val="function bold() { [native code] }"/>
+                <w:bCs w:val="function bold() { [native code] }"/>
+                <w:color w:val="111111"/>
+                <w:sz w:val="20"/>
+                <w:szCs w:val="20"/>
+                <w:rtl/>
+              </w:rPr>
+              <w:t xml:space="preserve">0</w:t>
+            </w:r>
+          </w:p>
+        </w:tc>
+        <w:tc>
+          <w:tcPr>
+            <w:tcW w:type="dxa" w:w="2400"/>
+            <w:tcBorders>
+              <w:top w:val="single" w:color="B4C4BC" w:sz="1"/>
+              <w:left w:val="single" w:color="B4C4BC" w:sz="1"/>
+              <w:bottom w:val="single" w:color="B4C4BC" w:sz="1"/>
+              <w:right w:val="single" w:color="B4C4BC" w:sz="1"/>
+            </w:tcBorders>
+            <w:shd w:fill="FFFFFF" w:val="clear"/>
+            <w:tcMar>
+              <w:top w:type="dxa" w:w="70"/>
+              <w:left w:type="dxa" w:w="100"/>
+              <w:bottom w:type="dxa" w:w="70"/>
+              <w:right w:type="dxa" w:w="100"/>
+            </w:tcMar>
+          </w:tcPr>
+          <w:p>
+            <w:pPr>
+              <w:bidi/>
+              <w:jc w:val="start"/>
+            </w:pPr>
+            <w:r>
+              <w:rPr>
+                <w:rFonts w:ascii="Arial" w:cs="Arial" w:eastAsia="Arial" w:hAnsi="Arial"/>
+                <w:b w:val="function bold() { [native code] }"/>
+                <w:bCs w:val="function bold() { [native code] }"/>
+                <w:color w:val="111111"/>
+                <w:sz w:val="20"/>
+                <w:szCs w:val="20"/>
+                <w:rtl/>
+              </w:rPr>
+              <w:t xml:space="preserve">(1,200,000)</w:t>
             </w:r>
           </w:p>
         </w:tc>
@@ -6997,7 +7134,7 @@
       <w:tr>
         <w:tc>
           <w:tcPr>
-            <w:tcW w:type="dxa" w:w="3026"/>
+            <w:tcW w:type="dxa" w:w="4226"/>
             <w:tcBorders>
               <w:top w:val="single" w:color="B4C4BC" w:sz="1"/>
               <w:left w:val="single" w:color="B4C4BC" w:sz="1"/>
@@ -7033,7 +7170,7 @@
         </w:tc>
         <w:tc>
           <w:tcPr>
-            <w:tcW w:type="dxa" w:w="3000"/>
+            <w:tcW w:type="dxa" w:w="2400"/>
             <w:tcBorders>
               <w:top w:val="single" w:color="B4C4BC" w:sz="1"/>
               <w:left w:val="single" w:color="B4C4BC" w:sz="1"/>
@@ -7069,37 +7206,37 @@
         </w:tc>
         <w:tc>
           <w:tcPr>
-            <w:tcW w:type="dxa" w:w="3000"/>
-            <w:tcBorders>
-              <w:top w:val="single" w:color="B4C4BC" w:sz="1"/>
-              <w:left w:val="single" w:color="B4C4BC" w:sz="1"/>
-              <w:bottom w:val="single" w:color="B4C4BC" w:sz="1"/>
-              <w:right w:val="single" w:color="B4C4BC" w:sz="1"/>
-            </w:tcBorders>
-            <w:shd w:fill="FFFFFF" w:val="clear"/>
-            <w:tcMar>
-              <w:top w:type="dxa" w:w="70"/>
-              <w:left w:type="dxa" w:w="100"/>
-              <w:bottom w:type="dxa" w:w="70"/>
-              <w:right w:type="dxa" w:w="100"/>
-            </w:tcMar>
-          </w:tcPr>
-          <w:p>
-            <w:pPr>
-              <w:bidi/>
-              <w:jc w:val="start"/>
-            </w:pPr>
-            <w:r>
-              <w:rPr>
-                <w:rFonts w:ascii="Arial" w:cs="Arial" w:eastAsia="Arial" w:hAnsi="Arial"/>
-                <w:b w:val="function bold() { [native code] }"/>
-                <w:bCs w:val="function bold() { [native code] }"/>
-                <w:color w:val="111111"/>
-                <w:sz w:val="20"/>
-                <w:szCs w:val="20"/>
-                <w:rtl/>
-              </w:rPr>
-              <w:t xml:space="preserve">(1,290,000)</w:t>
+            <w:tcW w:type="dxa" w:w="2400"/>
+            <w:tcBorders>
+              <w:top w:val="single" w:color="B4C4BC" w:sz="1"/>
+              <w:left w:val="single" w:color="B4C4BC" w:sz="1"/>
+              <w:bottom w:val="single" w:color="B4C4BC" w:sz="1"/>
+              <w:right w:val="single" w:color="B4C4BC" w:sz="1"/>
+            </w:tcBorders>
+            <w:shd w:fill="FFFFFF" w:val="clear"/>
+            <w:tcMar>
+              <w:top w:type="dxa" w:w="70"/>
+              <w:left w:type="dxa" w:w="100"/>
+              <w:bottom w:type="dxa" w:w="70"/>
+              <w:right w:type="dxa" w:w="100"/>
+            </w:tcMar>
+          </w:tcPr>
+          <w:p>
+            <w:pPr>
+              <w:bidi/>
+              <w:jc w:val="start"/>
+            </w:pPr>
+            <w:r>
+              <w:rPr>
+                <w:rFonts w:ascii="Arial" w:cs="Arial" w:eastAsia="Arial" w:hAnsi="Arial"/>
+                <w:b w:val="function bold() { [native code] }"/>
+                <w:bCs w:val="function bold() { [native code] }"/>
+                <w:color w:val="111111"/>
+                <w:sz w:val="20"/>
+                <w:szCs w:val="20"/>
+                <w:rtl/>
+              </w:rPr>
+              <w:t xml:space="preserve">(400,000)</w:t>
             </w:r>
           </w:p>
         </w:tc>
@@ -7107,7 +7244,7 @@
       <w:tr>
         <w:tc>
           <w:tcPr>
-            <w:tcW w:type="dxa" w:w="3026"/>
+            <w:tcW w:type="dxa" w:w="4226"/>
             <w:tcBorders>
               <w:top w:val="single" w:color="B4C4BC" w:sz="1"/>
               <w:left w:val="single" w:color="B4C4BC" w:sz="1"/>
@@ -7143,7 +7280,7 @@
         </w:tc>
         <w:tc>
           <w:tcPr>
-            <w:tcW w:type="dxa" w:w="3000"/>
+            <w:tcW w:type="dxa" w:w="2400"/>
             <w:tcBorders>
               <w:top w:val="single" w:color="B4C4BC" w:sz="1"/>
               <w:left w:val="single" w:color="B4C4BC" w:sz="1"/>
@@ -7179,37 +7316,37 @@
         </w:tc>
         <w:tc>
           <w:tcPr>
-            <w:tcW w:type="dxa" w:w="3000"/>
-            <w:tcBorders>
-              <w:top w:val="single" w:color="B4C4BC" w:sz="1"/>
-              <w:left w:val="single" w:color="B4C4BC" w:sz="1"/>
-              <w:bottom w:val="single" w:color="B4C4BC" w:sz="1"/>
-              <w:right w:val="single" w:color="B4C4BC" w:sz="1"/>
-            </w:tcBorders>
-            <w:shd w:fill="FFFFFF" w:val="clear"/>
-            <w:tcMar>
-              <w:top w:type="dxa" w:w="70"/>
-              <w:left w:type="dxa" w:w="100"/>
-              <w:bottom w:type="dxa" w:w="70"/>
-              <w:right w:type="dxa" w:w="100"/>
-            </w:tcMar>
-          </w:tcPr>
-          <w:p>
-            <w:pPr>
-              <w:bidi/>
-              <w:jc w:val="start"/>
-            </w:pPr>
-            <w:r>
-              <w:rPr>
-                <w:rFonts w:ascii="Arial" w:cs="Arial" w:eastAsia="Arial" w:hAnsi="Arial"/>
-                <w:b w:val="function bold() { [native code] }"/>
-                <w:bCs w:val="function bold() { [native code] }"/>
-                <w:color w:val="111111"/>
-                <w:sz w:val="20"/>
-                <w:szCs w:val="20"/>
-                <w:rtl/>
-              </w:rPr>
-              <w:t xml:space="preserve">510,000</w:t>
+            <w:tcW w:type="dxa" w:w="2400"/>
+            <w:tcBorders>
+              <w:top w:val="single" w:color="B4C4BC" w:sz="1"/>
+              <w:left w:val="single" w:color="B4C4BC" w:sz="1"/>
+              <w:bottom w:val="single" w:color="B4C4BC" w:sz="1"/>
+              <w:right w:val="single" w:color="B4C4BC" w:sz="1"/>
+            </w:tcBorders>
+            <w:shd w:fill="FFFFFF" w:val="clear"/>
+            <w:tcMar>
+              <w:top w:type="dxa" w:w="70"/>
+              <w:left w:type="dxa" w:w="100"/>
+              <w:bottom w:type="dxa" w:w="70"/>
+              <w:right w:type="dxa" w:w="100"/>
+            </w:tcMar>
+          </w:tcPr>
+          <w:p>
+            <w:pPr>
+              <w:bidi/>
+              <w:jc w:val="start"/>
+            </w:pPr>
+            <w:r>
+              <w:rPr>
+                <w:rFonts w:ascii="Arial" w:cs="Arial" w:eastAsia="Arial" w:hAnsi="Arial"/>
+                <w:b w:val="function bold() { [native code] }"/>
+                <w:bCs w:val="function bold() { [native code] }"/>
+                <w:color w:val="111111"/>
+                <w:sz w:val="20"/>
+                <w:szCs w:val="20"/>
+                <w:rtl/>
+              </w:rPr>
+              <w:t xml:space="preserve">1,400,000</w:t>
             </w:r>
           </w:p>
         </w:tc>
@@ -7217,7 +7354,7 @@
       <w:tr>
         <w:tc>
           <w:tcPr>
-            <w:tcW w:type="dxa" w:w="3026"/>
+            <w:tcW w:type="dxa" w:w="4226"/>
             <w:tcBorders>
               <w:top w:val="single" w:color="B4C4BC" w:sz="1"/>
               <w:left w:val="single" w:color="B4C4BC" w:sz="1"/>
@@ -7253,7 +7390,7 @@
         </w:tc>
         <w:tc>
           <w:tcPr>
-            <w:tcW w:type="dxa" w:w="3000"/>
+            <w:tcW w:type="dxa" w:w="2400"/>
             <w:tcBorders>
               <w:top w:val="single" w:color="B4C4BC" w:sz="1"/>
               <w:left w:val="single" w:color="B4C4BC" w:sz="1"/>
@@ -7289,37 +7426,37 @@
         </w:tc>
         <w:tc>
           <w:tcPr>
-            <w:tcW w:type="dxa" w:w="3000"/>
-            <w:tcBorders>
-              <w:top w:val="single" w:color="B4C4BC" w:sz="1"/>
-              <w:left w:val="single" w:color="B4C4BC" w:sz="1"/>
-              <w:bottom w:val="single" w:color="B4C4BC" w:sz="1"/>
-              <w:right w:val="single" w:color="B4C4BC" w:sz="1"/>
-            </w:tcBorders>
-            <w:shd w:fill="FFFFFF" w:val="clear"/>
-            <w:tcMar>
-              <w:top w:type="dxa" w:w="70"/>
-              <w:left w:type="dxa" w:w="100"/>
-              <w:bottom w:type="dxa" w:w="70"/>
-              <w:right w:type="dxa" w:w="100"/>
-            </w:tcMar>
-          </w:tcPr>
-          <w:p>
-            <w:pPr>
-              <w:bidi/>
-              <w:jc w:val="start"/>
-            </w:pPr>
-            <w:r>
-              <w:rPr>
-                <w:rFonts w:ascii="Arial" w:cs="Arial" w:eastAsia="Arial" w:hAnsi="Arial"/>
-                <w:b w:val="function bold() { [native code] }"/>
-                <w:bCs w:val="function bold() { [native code] }"/>
-                <w:color w:val="111111"/>
-                <w:sz w:val="20"/>
-                <w:szCs w:val="20"/>
-                <w:rtl/>
-              </w:rPr>
-              <w:t xml:space="preserve">3,710,000</w:t>
+            <w:tcW w:type="dxa" w:w="2400"/>
+            <w:tcBorders>
+              <w:top w:val="single" w:color="B4C4BC" w:sz="1"/>
+              <w:left w:val="single" w:color="B4C4BC" w:sz="1"/>
+              <w:bottom w:val="single" w:color="B4C4BC" w:sz="1"/>
+              <w:right w:val="single" w:color="B4C4BC" w:sz="1"/>
+            </w:tcBorders>
+            <w:shd w:fill="FFFFFF" w:val="clear"/>
+            <w:tcMar>
+              <w:top w:type="dxa" w:w="70"/>
+              <w:left w:type="dxa" w:w="100"/>
+              <w:bottom w:type="dxa" w:w="70"/>
+              <w:right w:type="dxa" w:w="100"/>
+            </w:tcMar>
+          </w:tcPr>
+          <w:p>
+            <w:pPr>
+              <w:bidi/>
+              <w:jc w:val="start"/>
+            </w:pPr>
+            <w:r>
+              <w:rPr>
+                <w:rFonts w:ascii="Arial" w:cs="Arial" w:eastAsia="Arial" w:hAnsi="Arial"/>
+                <w:b w:val="function bold() { [native code] }"/>
+                <w:bCs w:val="function bold() { [native code] }"/>
+                <w:color w:val="111111"/>
+                <w:sz w:val="20"/>
+                <w:szCs w:val="20"/>
+                <w:rtl/>
+              </w:rPr>
+              <w:t xml:space="preserve">4,600,000</w:t>
             </w:r>
           </w:p>
         </w:tc>
@@ -7329,6 +7466,20 @@
       <w:pPr>
         <w:spacing w:after="100"/>
       </w:pPr>
+    </w:p>
+    <w:p>
+      <w:pPr>
+        <w:bidi/>
+        <w:spacing w:after="120" w:line="300"/>
+        <w:jc w:val="start"/>
+      </w:pPr>
+      <w:r>
+        <w:rPr>
+          <w:rFonts w:ascii="Arial" w:cs="Arial" w:eastAsia="Arial" w:hAnsi="Arial"/>
+          <w:rtl/>
+        </w:rPr>
+        <w:t xml:space="preserve">التحقق من كفاية الاستثمار: ذروة الاحتياج التمويلي = 250,000 (تأسيس) + 600,000 (خسارة السنة 1) + 290,000 (خسارة السنة 2) = 1,140,000 ريال؛ وعليه حُدّد الاستثمار بـ 1.2 مليون ريال متضمناً احتياطياً نقدياً ~60 ألف ريال.</w:t>
+      </w:r>
     </w:p>
     <w:p>
       <w:pPr>
@@ -7513,7 +7664,7 @@
                 <w:szCs w:val="20"/>
                 <w:rtl/>
               </w:rPr>
-              <w:t xml:space="preserve">نقطة التعادل</w:t>
+              <w:t xml:space="preserve">نقطة التعادل التشغيلي</w:t>
             </w:r>
           </w:p>
         </w:tc>
@@ -7549,7 +7700,7 @@
                 <w:szCs w:val="20"/>
                 <w:rtl/>
               </w:rPr>
-              <w:t xml:space="preserve">الربع 1 — السنة 3</w:t>
+              <w:t xml:space="preserve">أوائل السنة 3</w:t>
             </w:r>
           </w:p>
         </w:tc>
@@ -7659,7 +7810,7 @@
                 <w:szCs w:val="20"/>
                 <w:rtl/>
               </w:rPr>
-              <w:t xml:space="preserve">~3.7 سنة</w:t>
+              <w:t xml:space="preserve">~3.2 سنة</w:t>
             </w:r>
           </w:p>
         </w:tc>
@@ -7695,7 +7846,7 @@
                 <w:szCs w:val="20"/>
                 <w:rtl/>
               </w:rPr>
-              <w:t xml:space="preserve">استعادة رأس المال المستثمر</w:t>
+              <w:t xml:space="preserve">التراكمي يتحول موجباً خلال السنة 4 (400,000 ÷ 1,800,000 ≈ 0.2)</w:t>
             </w:r>
           </w:p>
         </w:tc>
@@ -7769,7 +7920,7 @@
                 <w:szCs w:val="20"/>
                 <w:rtl/>
               </w:rPr>
-              <w:t xml:space="preserve">موجب</w:t>
+              <w:t xml:space="preserve">≈ +2.3 مليون ريال</w:t>
             </w:r>
           </w:p>
         </w:tc>
@@ -7805,7 +7956,7 @@
                 <w:szCs w:val="20"/>
                 <w:rtl/>
               </w:rPr>
-              <w:t xml:space="preserve">المشروع يضيف قيمة</w:t>
+              <w:t xml:space="preserve">المشروع يضيف قيمة بوضوح</w:t>
             </w:r>
           </w:p>
         </w:tc>
@@ -7879,7 +8030,7 @@
                 <w:szCs w:val="20"/>
                 <w:rtl/>
               </w:rPr>
-              <w:t xml:space="preserve">~35–45٪</w:t>
+              <w:t xml:space="preserve">~40٪</w:t>
             </w:r>
           </w:p>
         </w:tc>
@@ -7915,7 +8066,7 @@
                 <w:szCs w:val="20"/>
                 <w:rtl/>
               </w:rPr>
-              <w:t xml:space="preserve">عائد جذّاب مقابل المخاطرة</w:t>
+              <w:t xml:space="preserve">محسوب على تدفقات الجدول أعلاه — عائد جذّاب مقابل المخاطرة</w:t>
             </w:r>
           </w:p>
         </w:tc>
@@ -8025,7 +8176,7 @@
                 <w:szCs w:val="20"/>
                 <w:rtl/>
               </w:rPr>
-              <w:t xml:space="preserve">كفاءة تشغيلية جيدة</w:t>
+              <w:t xml:space="preserve">800,000 ÷ 3,600,000 من الإيراد</w:t>
             </w:r>
           </w:p>
         </w:tc>
@@ -8042,7 +8193,7 @@
           <w:rFonts w:ascii="Arial" w:cs="Arial" w:eastAsia="Arial" w:hAnsi="Arial"/>
           <w:rtl/>
         </w:rPr>
-        <w:t xml:space="preserve">ملاحظة: NPV و IRR تقديريان ويعتمدان على فرضيات النمو؛ يوصى بإعداد نموذج مالي تفصيلي (Excel) بسيناريوهات متعددة قبل جولة الاستثمار.</w:t>
+        <w:t xml:space="preserve">ملاحظة: NPV وIRR محسوبان على تدفقات السيناريو الأساسي أعلاه ويتغيران بتغيّر فرضيات النمو؛ يوصى بإعداد نموذج مالي تفصيلي (Excel) بسيناريوهات متعددة قبل جولة الاستثمار.</w:t>
       </w:r>
     </w:p>
     <w:p>
@@ -8429,7 +8580,7 @@
                 <w:szCs w:val="20"/>
                 <w:rtl/>
               </w:rPr>
-              <w:t xml:space="preserve">تعادل الربع 1 — السنة 3</w:t>
+              <w:t xml:space="preserve">تعادل أوائل السنة 3</w:t>
             </w:r>
           </w:p>
         </w:tc>

</xml_diff>